<commit_message>
Defense guide: fix layout — remove blank pages, add page numbers
Remove 3 inner manual page breaks that forced each section onto a new
page (left argument 5 alone on a near-blank page; pages 4 and 7 ended
half-empty). Content now flows naturally (8 → 7 pages). Add a footer
with page numbers (suppressed on the title page), give the diagram
caption breathing room, and fix "(página siguiente)" → "(a continuación)".
</commit_message>
<xml_diff>
--- a/defensa/Guia_Defensa_Android_Market.docx
+++ b/defensa/Guia_Defensa_Android_Market.docx
@@ -137,7 +137,7 @@
         <w:t xml:space="preserve">mensaje central</w:t>
       </w:r>
       <w:r>
-        <w:t xml:space="preserve"> (página siguiente). Si solo recuerdan una cosa, que sea esa.</w:t>
+        <w:t xml:space="preserve"> (a continuación). Si solo recuerdan una cosa, que sea esa.</w:t>
       </w:r>
     </w:p>
     <w:p>
@@ -407,11 +407,6 @@
       </w:r>
       <w:r>
         <w:t xml:space="preserve">.</w:t>
-      </w:r>
-    </w:p>
-    <w:p>
-      <w:r>
-        <w:br w:type="page"/>
       </w:r>
     </w:p>
     <w:p>
@@ -1354,7 +1349,7 @@
     </w:tbl>
     <w:p>
       <w:pPr>
-        <w:spacing w:after="120"/>
+        <w:spacing w:after="120" w:before="120"/>
       </w:pPr>
       <w:r>
         <w:rPr>
@@ -1426,11 +1421,6 @@
       </w:r>
       <w:r>
         <w:t xml:space="preserve"> consumo de repuesto). Si preguntan por qué algunas órdenes no tienen repuesto, esa es la respuesta: el modelo refleja la lógica real del negocio.</w:t>
-      </w:r>
-    </w:p>
-    <w:p>
-      <w:r>
-        <w:br w:type="page"/>
       </w:r>
     </w:p>
     <w:p>
@@ -1739,15 +1729,271 @@
           <w:iCs/>
           <w:color w:val="5B6770"/>
         </w:rPr>
-        <w:t xml:space="preserve">Apoyo: </w:t>
-      </w:r>
+        <w:t>Apoyo: Cita de respaldo: Laudon &amp; Laudon definen el SI como un conjunto de componentes interrelacionados que recolectan, procesan, almacenan y distribuyen información para apoyar la toma de decisiones.</w:t>
+      </w:r>
+    </w:p>
+    <w:p>
+      <w:pPr>
+        <w:keepNext/>
+        <w:spacing w:after="40" w:before="160"/>
+      </w:pPr>
+      <w:r>
+        <w:rPr>
+          <w:b/>
+          <w:bCs/>
+          <w:color w:val="0E7C86"/>
+        </w:rPr>
+        <w:t xml:space="preserve">P:  </w:t>
+      </w:r>
+      <w:r>
+        <w:rPr>
+          <w:b/>
+          <w:bCs/>
+          <w:color w:val="16324F"/>
+        </w:rPr>
+        <w:t xml:space="preserve">¿Qué aporta el sistema al negocio?</w:t>
+      </w:r>
+    </w:p>
+    <w:p>
+      <w:pPr>
+        <w:spacing w:after="140"/>
+        <w:ind w:left="360"/>
+      </w:pPr>
+      <w:r>
+        <w:rPr>
+          <w:b/>
+          <w:bCs/>
+          <w:color w:val="B5651D"/>
+        </w:rPr>
+        <w:t xml:space="preserve">R:  </w:t>
+      </w:r>
+      <w:r>
+        <w:t xml:space="preserve">Centraliza la información, mejora la trazabilidad de cada reparación, controla el consumo de repuestos y facilita la toma de decisiones: qué servicios son más solicitados, qué repuestos reponer y cuánto se ingresa por reparaciones.</w:t>
+      </w:r>
+    </w:p>
+    <w:p>
+      <w:pPr>
+        <w:pStyle w:val="Heading2"/>
+      </w:pPr>
+      <w:r>
+        <w:t xml:space="preserve">C. Sobre el modelo de datos (DER)</w:t>
+      </w:r>
+    </w:p>
+    <w:p>
+      <w:pPr>
+        <w:keepNext/>
+        <w:spacing w:after="40" w:before="160"/>
+      </w:pPr>
+      <w:r>
+        <w:rPr>
+          <w:b/>
+          <w:bCs/>
+          <w:color w:val="0E7C86"/>
+        </w:rPr>
+        <w:t xml:space="preserve">P:  </w:t>
+      </w:r>
+      <w:r>
+        <w:rPr>
+          <w:b/>
+          <w:bCs/>
+          <w:color w:val="16324F"/>
+        </w:rPr>
+        <w:t xml:space="preserve">¿Por qué ocho entidades y no menos?</w:t>
+      </w:r>
+    </w:p>
+    <w:p>
+      <w:pPr>
+        <w:spacing w:after="140"/>
+        <w:ind w:left="360"/>
+      </w:pPr>
+      <w:r>
+        <w:rPr>
+          <w:b/>
+          <w:bCs/>
+          <w:color w:val="B5651D"/>
+        </w:rPr>
+        <w:t xml:space="preserve">R:  </w:t>
+      </w:r>
+      <w:r>
+        <w:t xml:space="preserve">Porque el proceso real lo exige. Separar Cliente, Equipo, Orden, Diagnóstico, Repuesto, Detalle de repuesto y Pago evita repetir información y permite la trazabilidad. Por ejemplo, un cliente puede traer varios equipos en distintas fechas: si no separáramos las entidades, duplicaríamos sus datos.</w:t>
+      </w:r>
+    </w:p>
+    <w:p>
+      <w:pPr>
+        <w:keepNext/>
+        <w:spacing w:after="40" w:before="160"/>
+      </w:pPr>
+      <w:r>
+        <w:rPr>
+          <w:b/>
+          <w:bCs/>
+          <w:color w:val="0E7C86"/>
+        </w:rPr>
+        <w:t xml:space="preserve">P:  </w:t>
+      </w:r>
+      <w:r>
+        <w:rPr>
+          <w:b/>
+          <w:bCs/>
+          <w:color w:val="16324F"/>
+        </w:rPr>
+        <w:t xml:space="preserve">¿Qué función cumplen las llaves primarias y foráneas?</w:t>
+      </w:r>
+    </w:p>
+    <w:p>
+      <w:pPr>
+        <w:spacing w:after="140"/>
+        <w:ind w:left="360"/>
+      </w:pPr>
+      <w:r>
+        <w:rPr>
+          <w:b/>
+          <w:bCs/>
+          <w:color w:val="B5651D"/>
+        </w:rPr>
+        <w:t xml:space="preserve">R:  </w:t>
+      </w:r>
+      <w:r>
+        <w:t xml:space="preserve">La llave primaria (PK) identifica de forma única cada registro; por ejemplo ID_ORDEN. La llave foránea (FK) conecta tablas; por ejemplo, el Diagnóstico guarda el ID_ORDEN y el ID_TECNICO para saber a qué orden pertenece y quién la atendió. Así se garantiza integridad y se evita la redundancia.</w:t>
+      </w:r>
+    </w:p>
+    <w:p>
+      <w:pPr>
+        <w:keepNext/>
+        <w:spacing w:after="40" w:before="160"/>
+      </w:pPr>
+      <w:r>
+        <w:rPr>
+          <w:b/>
+          <w:bCs/>
+          <w:color w:val="0E7C86"/>
+        </w:rPr>
+        <w:t xml:space="preserve">P:  </w:t>
+      </w:r>
+      <w:r>
+        <w:rPr>
+          <w:b/>
+          <w:bCs/>
+          <w:color w:val="16324F"/>
+        </w:rPr>
+        <w:t xml:space="preserve">¿Cómo manejan la relación entre órdenes y repuestos?</w:t>
+      </w:r>
+    </w:p>
+    <w:p>
+      <w:pPr>
+        <w:spacing w:after="140"/>
+        <w:ind w:left="360"/>
+      </w:pPr>
+      <w:r>
+        <w:rPr>
+          <w:b/>
+          <w:bCs/>
+          <w:color w:val="B5651D"/>
+        </w:rPr>
+        <w:t xml:space="preserve">R:  </w:t>
+      </w:r>
+      <w:r>
+        <w:t xml:space="preserve">Una orden puede usar varios repuestos y un repuesto puede aparecer en varias órdenes — es una relación muchos-a-muchos. La resolvemos con la tabla intermedia DETALLE_REPUESTO, que registra qué repuesto, en qué cantidad y a qué orden corresponde, descontando del inventario.</w:t>
+      </w:r>
+    </w:p>
+    <w:p>
+      <w:pPr>
+        <w:keepNext/>
+        <w:spacing w:after="40" w:before="160"/>
+      </w:pPr>
+      <w:r>
+        <w:rPr>
+          <w:b/>
+          <w:bCs/>
+          <w:color w:val="0E7C86"/>
+        </w:rPr>
+        <w:t xml:space="preserve">P:  </w:t>
+      </w:r>
+      <w:r>
+        <w:rPr>
+          <w:b/>
+          <w:bCs/>
+          <w:color w:val="16324F"/>
+        </w:rPr>
+        <w:t xml:space="preserve">¿El modelo está normalizado?</w:t>
+      </w:r>
+    </w:p>
+    <w:p>
+      <w:pPr>
+        <w:spacing w:after="140"/>
+        <w:ind w:left="360"/>
+      </w:pPr>
+      <w:r>
+        <w:rPr>
+          <w:b/>
+          <w:bCs/>
+          <w:color w:val="B5651D"/>
+        </w:rPr>
+        <w:t xml:space="preserve">R:  </w:t>
+      </w:r>
+      <w:r>
+        <w:t xml:space="preserve">Sí, en lo esencial: cada dato vive en una sola entidad y las demás lo referencian por su llave. Por eso un cambio en los datos del cliente no obliga a corregirlo en veinte lugares.</w:t>
+      </w:r>
+    </w:p>
+    <w:p>
+      <w:pPr>
+        <w:pStyle w:val="Heading2"/>
+      </w:pPr>
+      <w:r>
+        <w:t xml:space="preserve">D. Sobre la implementación y la tecnología</w:t>
+      </w:r>
+    </w:p>
+    <w:p>
+      <w:pPr>
+        <w:keepNext/>
+        <w:spacing w:after="40" w:before="160"/>
+      </w:pPr>
+      <w:r>
+        <w:rPr>
+          <w:b/>
+          <w:bCs/>
+          <w:color w:val="0E7C86"/>
+        </w:rPr>
+        <w:t xml:space="preserve">P:  </w:t>
+      </w:r>
+      <w:r>
+        <w:rPr>
+          <w:b/>
+          <w:bCs/>
+          <w:color w:val="16324F"/>
+        </w:rPr>
+        <w:t xml:space="preserve">¿Mencionan Odoo en el documento; usaron Odoo?</w:t>
+      </w:r>
+    </w:p>
+    <w:p>
+      <w:pPr>
+        <w:spacing w:after="60"/>
+        <w:ind w:left="360"/>
+      </w:pPr>
+      <w:r>
+        <w:rPr>
+          <w:b/>
+          <w:bCs/>
+          <w:color w:val="B5651D"/>
+        </w:rPr>
+        <w:t xml:space="preserve">R:  </w:t>
+      </w:r>
+      <w:r>
+        <w:t xml:space="preserve">Mencionamos Odoo como alternativa de referencia en el marco teórico. En la práctica fuimos más allá y desarrollamos un sistema funcional propio que implementa nuestro modelo, ajustado al proceso específico del servicio técnico.</w:t>
+      </w:r>
+    </w:p>
+    <w:p>
+      <w:pPr>
+        <w:spacing w:after="140"/>
+        <w:ind w:left="360"/>
+      </w:pPr>
       <w:r>
         <w:rPr>
           <w:i/>
           <w:iCs/>
           <w:color w:val="5B6770"/>
         </w:rPr>
-        <w:t xml:space="preserve">Cita de respaldo: Laudon &amp; Laudon definen el SI como un conjunto de componentes interrelacionados que recolectan, procesan, almacenan y distribuyen información para apoyar la toma de decisiones.</w:t>
+        <w:t>Apoyo: Esta es la respuesta que desactiva la trampa del documento. Díganla con naturalidad y sin titubear.</w:t>
       </w:r>
     </w:p>
     <w:p>
@@ -1769,7 +2015,7 @@
           <w:bCs/>
           <w:color w:val="16324F"/>
         </w:rPr>
-        <w:t xml:space="preserve">¿Qué aporta el sistema al negocio?</w:t>
+        <w:t xml:space="preserve">¿Por qué funciona de forma local y no en la nube?</w:t>
       </w:r>
     </w:p>
     <w:p>
@@ -1786,15 +2032,7 @@
         <w:t xml:space="preserve">R:  </w:t>
       </w:r>
       <w:r>
-        <w:t xml:space="preserve">Centraliza la información, mejora la trazabilidad de cada reparación, controla el consumo de repuestos y facilita la toma de decisiones: qué servicios son más solicitados, qué repuestos reponer y cuánto se ingresa por reparaciones.</w:t>
-      </w:r>
-    </w:p>
-    <w:p>
-      <w:pPr>
-        <w:pStyle w:val="Heading2"/>
-      </w:pPr>
-      <w:r>
-        <w:t xml:space="preserve">C. Sobre el modelo de datos (DER)</w:t>
+        <w:t xml:space="preserve">Es una decisión de diseño, no una limitación. En Rurrenabaque la conectividad es variable; un sistema dependiente de la nube sería frágil. Uno local funciona siempre y puede sincronizar o ampliarse cuando se requiera.</w:t>
       </w:r>
     </w:p>
     <w:p>
@@ -1816,7 +2054,7 @@
           <w:bCs/>
           <w:color w:val="16324F"/>
         </w:rPr>
-        <w:t xml:space="preserve">¿Por qué ocho entidades y no menos?</w:t>
+        <w:t xml:space="preserve">¿Qué pasa si se daña la computadora?</w:t>
       </w:r>
     </w:p>
     <w:p>
@@ -1833,7 +2071,15 @@
         <w:t xml:space="preserve">R:  </w:t>
       </w:r>
       <w:r>
-        <w:t xml:space="preserve">Porque el proceso real lo exige. Separar Cliente, Equipo, Orden, Diagnóstico, Repuesto, Detalle de repuesto y Pago evita repetir información y permite la trazabilidad. Por ejemplo, un cliente puede traer varios equipos en distintas fechas: si no separáramos las entidades, duplicaríamos sus datos.</w:t>
+        <w:t xml:space="preserve">La información puede respaldarse y exportarse. Tratamos los datos como un activo del negocio, no como algo atado a un solo equipo. El respaldo periódico forma parte de las recomendaciones de implementación.</w:t>
+      </w:r>
+    </w:p>
+    <w:p>
+      <w:pPr>
+        <w:pStyle w:val="Heading2"/>
+      </w:pPr>
+      <w:r>
+        <w:t xml:space="preserve">E. Sobre el crecimiento y la viabilidad</w:t>
       </w:r>
     </w:p>
     <w:p>
@@ -1855,7 +2101,7 @@
           <w:bCs/>
           <w:color w:val="16324F"/>
         </w:rPr>
-        <w:t xml:space="preserve">¿Qué función cumplen las llaves primarias y foráneas?</w:t>
+        <w:t xml:space="preserve">¿El sistema puede crecer en el futuro?</w:t>
       </w:r>
     </w:p>
     <w:p>
@@ -1872,7 +2118,7 @@
         <w:t xml:space="preserve">R:  </w:t>
       </w:r>
       <w:r>
-        <w:t xml:space="preserve">La llave primaria (PK) identifica de forma única cada registro; por ejemplo ID_ORDEN. La llave foránea (FK) conecta tablas; por ejemplo, el Diagnóstico guarda el ID_ORDEN y el ID_TECNICO para saber a qué orden pertenece y quién la atendió. Así se garantiza integridad y se evita la redundancia.</w:t>
+        <w:t xml:space="preserve">Sí. La estructura fue diseñada para permitir nuevas funcionalidades, usuarios adicionales y extensiones — multiusuario, app móvil, portal de clientes, varias sucursales — sin reconstruir el sistema desde cero.</w:t>
       </w:r>
     </w:p>
     <w:p>
@@ -1894,7 +2140,7 @@
           <w:bCs/>
           <w:color w:val="16324F"/>
         </w:rPr>
-        <w:t xml:space="preserve">¿Cómo manejan la relación entre órdenes y repuestos?</w:t>
+        <w:t xml:space="preserve">¿Es realista implementarlo en este negocio?</w:t>
       </w:r>
     </w:p>
     <w:p>
@@ -1911,7 +2157,15 @@
         <w:t xml:space="preserve">R:  </w:t>
       </w:r>
       <w:r>
-        <w:t xml:space="preserve">Una orden puede usar varios repuestos y un repuesto puede aparecer en varias órdenes — es una relación muchos-a-muchos. La resolvemos con la tabla intermedia DETALLE_REPUESTO, que registra qué repuesto, en qué cantidad y a qué orden corresponde, descontando del inventario.</w:t>
+        <w:t xml:space="preserve">Sí. Proponemos una implementación por etapas: primero órdenes de servicio e inventario de repuestos, luego reportes, y después extensiones. Empezar simple y crecer es lo más viable para un negocio pequeño.</w:t>
+      </w:r>
+    </w:p>
+    <w:p>
+      <w:pPr>
+        <w:pStyle w:val="Heading2"/>
+      </w:pPr>
+      <w:r>
+        <w:t xml:space="preserve">F. Sobre la diferenciación (sin atacar a nadie)</w:t>
       </w:r>
     </w:p>
     <w:p>
@@ -1933,54 +2187,7 @@
           <w:bCs/>
           <w:color w:val="16324F"/>
         </w:rPr>
-        <w:t xml:space="preserve">¿El modelo está normalizado?</w:t>
-      </w:r>
-    </w:p>
-    <w:p>
-      <w:pPr>
-        <w:spacing w:after="140"/>
-        <w:ind w:left="360"/>
-      </w:pPr>
-      <w:r>
-        <w:rPr>
-          <w:b/>
-          <w:bCs/>
-          <w:color w:val="B5651D"/>
-        </w:rPr>
-        <w:t xml:space="preserve">R:  </w:t>
-      </w:r>
-      <w:r>
-        <w:t xml:space="preserve">Sí, en lo esencial: cada dato vive en una sola entidad y las demás lo referencian por su llave. Por eso un cambio en los datos del cliente no obliga a corregirlo en veinte lugares.</w:t>
-      </w:r>
-    </w:p>
-    <w:p>
-      <w:pPr>
-        <w:pStyle w:val="Heading2"/>
-      </w:pPr>
-      <w:r>
-        <w:t xml:space="preserve">D. Sobre la implementación y la tecnología</w:t>
-      </w:r>
-    </w:p>
-    <w:p>
-      <w:pPr>
-        <w:keepNext/>
-        <w:spacing w:after="40" w:before="160"/>
-      </w:pPr>
-      <w:r>
-        <w:rPr>
-          <w:b/>
-          <w:bCs/>
-          <w:color w:val="0E7C86"/>
-        </w:rPr>
-        <w:t xml:space="preserve">P:  </w:t>
-      </w:r>
-      <w:r>
-        <w:rPr>
-          <w:b/>
-          <w:bCs/>
-          <w:color w:val="16324F"/>
-        </w:rPr>
-        <w:t xml:space="preserve">¿Mencionan Odoo en el documento; usaron Odoo?</w:t>
+        <w:t xml:space="preserve">¿Qué distingue su proyecto de los de otros grupos?</w:t>
       </w:r>
     </w:p>
     <w:p>
@@ -1997,7 +2204,7 @@
         <w:t xml:space="preserve">R:  </w:t>
       </w:r>
       <w:r>
-        <w:t xml:space="preserve">Mencionamos Odoo como alternativa de referencia en el marco teórico. En la práctica fuimos más allá y desarrollamos un sistema funcional propio que implementa nuestro modelo, ajustado al proceso específico del servicio técnico.</w:t>
+        <w:t xml:space="preserve">Nuestro enfoque fue representar de manera más completa el flujo operativo de un servicio técnico. No nos quedamos en producto–venta–inventario: modelamos un proceso de reparación con varios estados y trazabilidad por orden. Es una solución ajustada a las necesidades específicas del negocio.</w:t>
       </w:r>
     </w:p>
     <w:p>
@@ -2011,15 +2218,68 @@
           <w:iCs/>
           <w:color w:val="5B6770"/>
         </w:rPr>
-        <w:t xml:space="preserve">Apoyo: </w:t>
-      </w:r>
+        <w:t>Apoyo: Nunca digan “lo nuestro es mejor” ni “los demás solo hicieron…”. Hablen de SU enfoque, no de los defectos ajenos.</w:t>
+      </w:r>
+    </w:p>
+    <w:p>
+      <w:pPr>
+        <w:pStyle w:val="Heading2"/>
+      </w:pPr>
+      <w:r>
+        <w:t xml:space="preserve">G. Preguntas difíciles / trampa</w:t>
+      </w:r>
+    </w:p>
+    <w:p>
+      <w:pPr>
+        <w:keepNext/>
+        <w:spacing w:after="40" w:before="160"/>
+      </w:pPr>
+      <w:r>
+        <w:rPr>
+          <w:b/>
+          <w:bCs/>
+          <w:color w:val="0E7C86"/>
+        </w:rPr>
+        <w:t xml:space="preserve">P:  </w:t>
+      </w:r>
+      <w:r>
+        <w:rPr>
+          <w:b/>
+          <w:bCs/>
+          <w:color w:val="16324F"/>
+        </w:rPr>
+        <w:t xml:space="preserve">En los pagos no veo el monto total por orden. ¿Por qué?</w:t>
+      </w:r>
+    </w:p>
+    <w:p>
+      <w:pPr>
+        <w:spacing w:after="60"/>
+        <w:ind w:left="360"/>
+      </w:pPr>
+      <w:r>
+        <w:rPr>
+          <w:b/>
+          <w:bCs/>
+          <w:color w:val="B5651D"/>
+        </w:rPr>
+        <w:t xml:space="preserve">R:  </w:t>
+      </w:r>
+      <w:r>
+        <w:t xml:space="preserve">El total de cada orden se calcula sumando la mano de obra del diagnóstico más los repuestos consumidos en el detalle. En la hoja de control general se observa esa unión. Es un dato derivado, no uno que se escriba a mano, para evitar errores.</w:t>
+      </w:r>
+    </w:p>
+    <w:p>
+      <w:pPr>
+        <w:spacing w:after="140"/>
+        <w:ind w:left="360"/>
+      </w:pPr>
       <w:r>
         <w:rPr>
           <w:i/>
           <w:iCs/>
           <w:color w:val="5B6770"/>
         </w:rPr>
-        <w:t xml:space="preserve">Esta es la respuesta que desactiva la trampa del documento. Díganla con naturalidad y sin titubear.</w:t>
+        <w:t>Apoyo: Sean honestos aquí: si algún total está vacío, es porque se calcula, no porque falte. Muestren la fórmula: Total = Mano de obra + Repuestos.</w:t>
       </w:r>
     </w:p>
     <w:p>
@@ -2041,7 +2301,7 @@
           <w:bCs/>
           <w:color w:val="16324F"/>
         </w:rPr>
-        <w:t xml:space="preserve">¿Por qué funciona de forma local y no en la nube?</w:t>
+        <w:t xml:space="preserve">¿Esto no lo podían hacer en un simple Excel?</w:t>
       </w:r>
     </w:p>
     <w:p>
@@ -2058,7 +2318,7 @@
         <w:t xml:space="preserve">R:  </w:t>
       </w:r>
       <w:r>
-        <w:t xml:space="preserve">Es una decisión de diseño, no una limitación. En Rurrenabaque la conectividad es variable; un sistema dependiente de la nube sería frágil. Uno local funciona siempre y puede sincronizar o ampliarse cuando se requiera.</w:t>
+        <w:t xml:space="preserve">Excel sirve para empezar, pero no garantiza integridad ni relaciones entre datos: es fácil duplicar un cliente o romper la trazabilidad. Nuestro modelo relacional con llaves asegura que cada reparación quede correctamente vinculada a su cliente, técnico, repuestos y pago.</w:t>
       </w:r>
     </w:p>
     <w:p>
@@ -2080,7 +2340,7 @@
           <w:bCs/>
           <w:color w:val="16324F"/>
         </w:rPr>
-        <w:t xml:space="preserve">¿Qué pasa si se daña la computadora?</w:t>
+        <w:t xml:space="preserve">Si tuvieran más tiempo, ¿qué mejorarían?</w:t>
       </w:r>
     </w:p>
     <w:p>
@@ -2097,314 +2357,7 @@
         <w:t xml:space="preserve">R:  </w:t>
       </w:r>
       <w:r>
-        <w:t xml:space="preserve">La información puede respaldarse y exportarse. Tratamos los datos como un activo del negocio, no como algo atado a un solo equipo. El respaldo periódico forma parte de las recomendaciones de implementación.</w:t>
-      </w:r>
-    </w:p>
-    <w:p>
-      <w:pPr>
-        <w:pStyle w:val="Heading2"/>
-      </w:pPr>
-      <w:r>
-        <w:t xml:space="preserve">E. Sobre el crecimiento y la viabilidad</w:t>
-      </w:r>
-    </w:p>
-    <w:p>
-      <w:pPr>
-        <w:keepNext/>
-        <w:spacing w:after="40" w:before="160"/>
-      </w:pPr>
-      <w:r>
-        <w:rPr>
-          <w:b/>
-          <w:bCs/>
-          <w:color w:val="0E7C86"/>
-        </w:rPr>
-        <w:t xml:space="preserve">P:  </w:t>
-      </w:r>
-      <w:r>
-        <w:rPr>
-          <w:b/>
-          <w:bCs/>
-          <w:color w:val="16324F"/>
-        </w:rPr>
-        <w:t xml:space="preserve">¿El sistema puede crecer en el futuro?</w:t>
-      </w:r>
-    </w:p>
-    <w:p>
-      <w:pPr>
-        <w:spacing w:after="140"/>
-        <w:ind w:left="360"/>
-      </w:pPr>
-      <w:r>
-        <w:rPr>
-          <w:b/>
-          <w:bCs/>
-          <w:color w:val="B5651D"/>
-        </w:rPr>
-        <w:t xml:space="preserve">R:  </w:t>
-      </w:r>
-      <w:r>
-        <w:t xml:space="preserve">Sí. La estructura fue diseñada para permitir nuevas funcionalidades, usuarios adicionales y extensiones — multiusuario, app móvil, portal de clientes, varias sucursales — sin reconstruir el sistema desde cero.</w:t>
-      </w:r>
-    </w:p>
-    <w:p>
-      <w:pPr>
-        <w:keepNext/>
-        <w:spacing w:after="40" w:before="160"/>
-      </w:pPr>
-      <w:r>
-        <w:rPr>
-          <w:b/>
-          <w:bCs/>
-          <w:color w:val="0E7C86"/>
-        </w:rPr>
-        <w:t xml:space="preserve">P:  </w:t>
-      </w:r>
-      <w:r>
-        <w:rPr>
-          <w:b/>
-          <w:bCs/>
-          <w:color w:val="16324F"/>
-        </w:rPr>
-        <w:t xml:space="preserve">¿Es realista implementarlo en este negocio?</w:t>
-      </w:r>
-    </w:p>
-    <w:p>
-      <w:pPr>
-        <w:spacing w:after="140"/>
-        <w:ind w:left="360"/>
-      </w:pPr>
-      <w:r>
-        <w:rPr>
-          <w:b/>
-          <w:bCs/>
-          <w:color w:val="B5651D"/>
-        </w:rPr>
-        <w:t xml:space="preserve">R:  </w:t>
-      </w:r>
-      <w:r>
-        <w:t xml:space="preserve">Sí. Proponemos una implementación por etapas: primero órdenes de servicio e inventario de repuestos, luego reportes, y después extensiones. Empezar simple y crecer es lo más viable para un negocio pequeño.</w:t>
-      </w:r>
-    </w:p>
-    <w:p>
-      <w:pPr>
-        <w:pStyle w:val="Heading2"/>
-      </w:pPr>
-      <w:r>
-        <w:t xml:space="preserve">F. Sobre la diferenciación (sin atacar a nadie)</w:t>
-      </w:r>
-    </w:p>
-    <w:p>
-      <w:pPr>
-        <w:keepNext/>
-        <w:spacing w:after="40" w:before="160"/>
-      </w:pPr>
-      <w:r>
-        <w:rPr>
-          <w:b/>
-          <w:bCs/>
-          <w:color w:val="0E7C86"/>
-        </w:rPr>
-        <w:t xml:space="preserve">P:  </w:t>
-      </w:r>
-      <w:r>
-        <w:rPr>
-          <w:b/>
-          <w:bCs/>
-          <w:color w:val="16324F"/>
-        </w:rPr>
-        <w:t xml:space="preserve">¿Qué distingue su proyecto de los de otros grupos?</w:t>
-      </w:r>
-    </w:p>
-    <w:p>
-      <w:pPr>
-        <w:spacing w:after="60"/>
-        <w:ind w:left="360"/>
-      </w:pPr>
-      <w:r>
-        <w:rPr>
-          <w:b/>
-          <w:bCs/>
-          <w:color w:val="B5651D"/>
-        </w:rPr>
-        <w:t xml:space="preserve">R:  </w:t>
-      </w:r>
-      <w:r>
-        <w:t xml:space="preserve">Nuestro enfoque fue representar de manera más completa el flujo operativo de un servicio técnico. No nos quedamos en producto–venta–inventario: modelamos un proceso de reparación con varios estados y trazabilidad por orden. Es una solución ajustada a las necesidades específicas del negocio.</w:t>
-      </w:r>
-    </w:p>
-    <w:p>
-      <w:pPr>
-        <w:spacing w:after="140"/>
-        <w:ind w:left="360"/>
-      </w:pPr>
-      <w:r>
-        <w:rPr>
-          <w:i/>
-          <w:iCs/>
-          <w:color w:val="5B6770"/>
-        </w:rPr>
-        <w:t xml:space="preserve">Apoyo: </w:t>
-      </w:r>
-      <w:r>
-        <w:rPr>
-          <w:i/>
-          <w:iCs/>
-          <w:color w:val="5B6770"/>
-        </w:rPr>
-        <w:t xml:space="preserve">Nunca digan “lo nuestro es mejor” ni “los demás solo hicieron…”. Hablen de SU enfoque, no de los defectos ajenos.</w:t>
-      </w:r>
-    </w:p>
-    <w:p>
-      <w:pPr>
-        <w:pStyle w:val="Heading2"/>
-      </w:pPr>
-      <w:r>
-        <w:t xml:space="preserve">G. Preguntas difíciles / trampa</w:t>
-      </w:r>
-    </w:p>
-    <w:p>
-      <w:pPr>
-        <w:keepNext/>
-        <w:spacing w:after="40" w:before="160"/>
-      </w:pPr>
-      <w:r>
-        <w:rPr>
-          <w:b/>
-          <w:bCs/>
-          <w:color w:val="0E7C86"/>
-        </w:rPr>
-        <w:t xml:space="preserve">P:  </w:t>
-      </w:r>
-      <w:r>
-        <w:rPr>
-          <w:b/>
-          <w:bCs/>
-          <w:color w:val="16324F"/>
-        </w:rPr>
-        <w:t xml:space="preserve">En los pagos no veo el monto total por orden. ¿Por qué?</w:t>
-      </w:r>
-    </w:p>
-    <w:p>
-      <w:pPr>
-        <w:spacing w:after="60"/>
-        <w:ind w:left="360"/>
-      </w:pPr>
-      <w:r>
-        <w:rPr>
-          <w:b/>
-          <w:bCs/>
-          <w:color w:val="B5651D"/>
-        </w:rPr>
-        <w:t xml:space="preserve">R:  </w:t>
-      </w:r>
-      <w:r>
-        <w:t xml:space="preserve">El total de cada orden se calcula sumando la mano de obra del diagnóstico más los repuestos consumidos en el detalle. En la hoja de control general se observa esa unión. Es un dato derivado, no uno que se escriba a mano, para evitar errores.</w:t>
-      </w:r>
-    </w:p>
-    <w:p>
-      <w:pPr>
-        <w:spacing w:after="140"/>
-        <w:ind w:left="360"/>
-      </w:pPr>
-      <w:r>
-        <w:rPr>
-          <w:i/>
-          <w:iCs/>
-          <w:color w:val="5B6770"/>
-        </w:rPr>
-        <w:t xml:space="preserve">Apoyo: </w:t>
-      </w:r>
-      <w:r>
-        <w:rPr>
-          <w:i/>
-          <w:iCs/>
-          <w:color w:val="5B6770"/>
-        </w:rPr>
-        <w:t xml:space="preserve">Sean honestos aquí: si algún total está vacío, es porque se calcula, no porque falte. Muestren la fórmula: Total = Mano de obra + Repuestos.</w:t>
-      </w:r>
-    </w:p>
-    <w:p>
-      <w:pPr>
-        <w:keepNext/>
-        <w:spacing w:after="40" w:before="160"/>
-      </w:pPr>
-      <w:r>
-        <w:rPr>
-          <w:b/>
-          <w:bCs/>
-          <w:color w:val="0E7C86"/>
-        </w:rPr>
-        <w:t xml:space="preserve">P:  </w:t>
-      </w:r>
-      <w:r>
-        <w:rPr>
-          <w:b/>
-          <w:bCs/>
-          <w:color w:val="16324F"/>
-        </w:rPr>
-        <w:t xml:space="preserve">¿Esto no lo podían hacer en un simple Excel?</w:t>
-      </w:r>
-    </w:p>
-    <w:p>
-      <w:pPr>
-        <w:spacing w:after="140"/>
-        <w:ind w:left="360"/>
-      </w:pPr>
-      <w:r>
-        <w:rPr>
-          <w:b/>
-          <w:bCs/>
-          <w:color w:val="B5651D"/>
-        </w:rPr>
-        <w:t xml:space="preserve">R:  </w:t>
-      </w:r>
-      <w:r>
-        <w:t xml:space="preserve">Excel sirve para empezar, pero no garantiza integridad ni relaciones entre datos: es fácil duplicar un cliente o romper la trazabilidad. Nuestro modelo relacional con llaves asegura que cada reparación quede correctamente vinculada a su cliente, técnico, repuestos y pago.</w:t>
-      </w:r>
-    </w:p>
-    <w:p>
-      <w:pPr>
-        <w:keepNext/>
-        <w:spacing w:after="40" w:before="160"/>
-      </w:pPr>
-      <w:r>
-        <w:rPr>
-          <w:b/>
-          <w:bCs/>
-          <w:color w:val="0E7C86"/>
-        </w:rPr>
-        <w:t xml:space="preserve">P:  </w:t>
-      </w:r>
-      <w:r>
-        <w:rPr>
-          <w:b/>
-          <w:bCs/>
-          <w:color w:val="16324F"/>
-        </w:rPr>
-        <w:t xml:space="preserve">Si tuvieran más tiempo, ¿qué mejorarían?</w:t>
-      </w:r>
-    </w:p>
-    <w:p>
-      <w:pPr>
-        <w:spacing w:after="140"/>
-        <w:ind w:left="360"/>
-      </w:pPr>
-      <w:r>
-        <w:rPr>
-          <w:b/>
-          <w:bCs/>
-          <w:color w:val="B5651D"/>
-        </w:rPr>
-        <w:t xml:space="preserve">R:  </w:t>
-      </w:r>
-      <w:r>
         <w:t xml:space="preserve">Reportes automáticos más completos, alertas de stock mínimo en pantalla y un acceso por roles para varios usuarios. La base ya está; serían extensiones sobre el mismo modelo.</w:t>
-      </w:r>
-    </w:p>
-    <w:p>
-      <w:r>
-        <w:br w:type="page"/>
       </w:r>
     </w:p>
     <w:p>
@@ -3329,9 +3282,12 @@
       </w:r>
     </w:p>
     <w:sectPr>
+      <w:footerReference w:type="default" r:id="rId8"/>
+      <w:footerReference w:type="first" r:id="rId9"/>
       <w:pgSz w:w="12240" w:h="15840" w:orient="portrait"/>
       <w:pgMar w:top="1300" w:right="1300" w:bottom="1300" w:left="1300" w:header="708" w:footer="708" w:gutter="0"/>
       <w:pgNumType/>
+      <w:titlePg/>
       <w:docGrid w:linePitch="360"/>
     </w:sectPr>
   </w:body>
@@ -3377,6 +3333,71 @@
     </w:p>
   </w:endnote>
 </w:endnotes>
+</file>
+
+<file path=word/footer1.xml><?xml version="1.0" encoding="utf-8"?>
+<w:ftr xmlns:w="http://schemas.openxmlformats.org/wordprocessingml/2006/main" xmlns:r="http://schemas.openxmlformats.org/officeDocument/2006/relationships">
+  <w:p>
+    <w:pPr>
+      <w:jc w:val="center"/>
+      <w:rPr>
+        <w:color w:val="808080"/>
+        <w:sz w:val="18"/>
+        <w:szCs w:val="18"/>
+      </w:rPr>
+    </w:pPr>
+    <w:r>
+      <w:rPr>
+        <w:color w:val="808080"/>
+        <w:sz w:val="18"/>
+        <w:szCs w:val="18"/>
+      </w:rPr>
+      <w:t xml:space="preserve">Android Market · Guía de Defensa</w:t>
+    </w:r>
+    <w:r>
+      <w:rPr>
+        <w:color w:val="808080"/>
+        <w:sz w:val="18"/>
+        <w:szCs w:val="18"/>
+      </w:rPr>
+      <w:t xml:space="preserve">  —  Página </w:t>
+    </w:r>
+    <w:r>
+      <w:rPr>
+        <w:color w:val="808080"/>
+        <w:sz w:val="18"/>
+        <w:szCs w:val="18"/>
+      </w:rPr>
+      <w:fldChar w:fldCharType="begin"/>
+    </w:r>
+    <w:r>
+      <w:rPr>
+        <w:color w:val="808080"/>
+        <w:sz w:val="18"/>
+        <w:szCs w:val="18"/>
+      </w:rPr>
+      <w:instrText xml:space="preserve"> PAGE </w:instrText>
+    </w:r>
+    <w:r>
+      <w:rPr>
+        <w:color w:val="808080"/>
+        <w:sz w:val="18"/>
+        <w:szCs w:val="18"/>
+      </w:rPr>
+      <w:fldChar w:fldCharType="end"/>
+    </w:r>
+  </w:p>
+</w:ftr>
+</file>
+
+<file path=word/footer2.xml><?xml version="1.0" encoding="utf-8"?>
+<w:ftr xmlns:w="http://schemas.openxmlformats.org/wordprocessingml/2006/main" xmlns:r="http://schemas.openxmlformats.org/officeDocument/2006/relationships">
+  <w:p>
+    <w:pPr>
+      <w:jc w:val="center"/>
+    </w:pPr>
+  </w:p>
+</w:ftr>
 </file>
 
 <file path=word/footnotes.xml><?xml version="1.0" encoding="utf-8"?>

</xml_diff>